<commit_message>
added screenshots to SQL docx
</commit_message>
<xml_diff>
--- a/docs/RaceDayDb.docx
+++ b/docs/RaceDayDb.docx
@@ -28,33 +28,13 @@
     </w:p>
     <w:p>
       <w:r>
-        <w:t xml:space="preserve">CREATE DATABASE IF NOT EXISTS </w:t>
-      </w:r>
-      <w:proofErr w:type="spellStart"/>
-      <w:proofErr w:type="gramStart"/>
-      <w:r>
-        <w:t>RaceDayDB</w:t>
-      </w:r>
-      <w:proofErr w:type="spellEnd"/>
-      <w:r>
-        <w:t>;</w:t>
-      </w:r>
-      <w:proofErr w:type="gramEnd"/>
-    </w:p>
-    <w:p>
-      <w:r>
-        <w:t xml:space="preserve">USE </w:t>
-      </w:r>
-      <w:proofErr w:type="spellStart"/>
-      <w:proofErr w:type="gramStart"/>
-      <w:r>
-        <w:t>RaceDayDB</w:t>
-      </w:r>
-      <w:proofErr w:type="spellEnd"/>
-      <w:r>
-        <w:t>;</w:t>
-      </w:r>
-      <w:proofErr w:type="gramEnd"/>
+        <w:t>CREATE DATABASE IF NOT EXISTS RaceDayDB;</w:t>
+      </w:r>
+    </w:p>
+    <w:p>
+      <w:r>
+        <w:t>USE RaceDayDB;</w:t>
+      </w:r>
     </w:p>
     <w:p>
       <w:pPr>
@@ -82,36 +62,12 @@
     </w:p>
     <w:p>
       <w:r>
-        <w:t xml:space="preserve">    </w:t>
-      </w:r>
-      <w:proofErr w:type="spellStart"/>
-      <w:r>
-        <w:t>RoleId</w:t>
-      </w:r>
-      <w:proofErr w:type="spellEnd"/>
-      <w:r>
-        <w:t xml:space="preserve"> INT AUTO_INCREMENT PRIMARY KEY,</w:t>
-      </w:r>
-    </w:p>
-    <w:p>
-      <w:r>
-        <w:t xml:space="preserve">    </w:t>
-      </w:r>
-      <w:proofErr w:type="spellStart"/>
-      <w:r>
-        <w:t>RoleName</w:t>
-      </w:r>
-      <w:proofErr w:type="spellEnd"/>
-      <w:r>
-        <w:t xml:space="preserve"> </w:t>
-      </w:r>
-      <w:proofErr w:type="gramStart"/>
-      <w:r>
-        <w:t>VARCHAR(</w:t>
-      </w:r>
-      <w:proofErr w:type="gramEnd"/>
-      <w:r>
-        <w:t>30) NOT NULL UNIQUE</w:t>
+        <w:t xml:space="preserve">    RoleId INT AUTO_INCREMENT PRIMARY KEY,</w:t>
+      </w:r>
+    </w:p>
+    <w:p>
+      <w:r>
+        <w:t xml:space="preserve">    RoleName VARCHAR(30) NOT NULL UNIQUE</w:t>
       </w:r>
     </w:p>
     <w:p>
@@ -145,182 +101,57 @@
     </w:p>
     <w:p>
       <w:r>
-        <w:t xml:space="preserve">    </w:t>
-      </w:r>
-      <w:proofErr w:type="spellStart"/>
-      <w:r>
-        <w:t>UserId</w:t>
-      </w:r>
-      <w:proofErr w:type="spellEnd"/>
-      <w:r>
-        <w:t xml:space="preserve"> INT AUTO_INCREMENT PRIMARY KEY,</w:t>
-      </w:r>
-    </w:p>
-    <w:p>
-      <w:r>
-        <w:t xml:space="preserve">    </w:t>
-      </w:r>
-      <w:proofErr w:type="spellStart"/>
-      <w:r>
-        <w:t>RoleId</w:t>
-      </w:r>
-      <w:proofErr w:type="spellEnd"/>
-      <w:r>
-        <w:t xml:space="preserve"> INT NOT NULL,</w:t>
-      </w:r>
-    </w:p>
-    <w:p>
-      <w:r>
-        <w:t xml:space="preserve">    FirstName </w:t>
-      </w:r>
-      <w:proofErr w:type="gramStart"/>
-      <w:r>
-        <w:t>VARCHAR(</w:t>
-      </w:r>
-      <w:proofErr w:type="gramEnd"/>
-      <w:r>
-        <w:t>80) NOT NULL,</w:t>
-      </w:r>
-    </w:p>
-    <w:p>
-      <w:r>
-        <w:t xml:space="preserve">    LastName </w:t>
-      </w:r>
-      <w:proofErr w:type="gramStart"/>
-      <w:r>
-        <w:t>VARCHAR(</w:t>
-      </w:r>
-      <w:proofErr w:type="gramEnd"/>
-      <w:r>
-        <w:t>80) NOT NULL,</w:t>
-      </w:r>
-    </w:p>
-    <w:p>
-      <w:r>
-        <w:t xml:space="preserve">    Email </w:t>
-      </w:r>
-      <w:proofErr w:type="gramStart"/>
-      <w:r>
-        <w:t>VARCHAR(</w:t>
-      </w:r>
-      <w:proofErr w:type="gramEnd"/>
-      <w:r>
-        <w:t>255) NOT NULL UNIQUE,</w:t>
-      </w:r>
-    </w:p>
-    <w:p>
-      <w:r>
-        <w:t xml:space="preserve">    </w:t>
-      </w:r>
-      <w:proofErr w:type="spellStart"/>
-      <w:r>
-        <w:t>PasswordHash</w:t>
-      </w:r>
-      <w:proofErr w:type="spellEnd"/>
-      <w:r>
-        <w:t xml:space="preserve"> </w:t>
-      </w:r>
-      <w:proofErr w:type="gramStart"/>
-      <w:r>
-        <w:t>VARCHAR(</w:t>
-      </w:r>
-      <w:proofErr w:type="gramEnd"/>
-      <w:r>
-        <w:t>500) NOT NULL,</w:t>
-      </w:r>
-    </w:p>
-    <w:p>
-      <w:r>
-        <w:t xml:space="preserve">    </w:t>
-      </w:r>
-      <w:proofErr w:type="spellStart"/>
-      <w:r>
-        <w:t>PhoneNumber</w:t>
-      </w:r>
-      <w:proofErr w:type="spellEnd"/>
-      <w:r>
-        <w:t xml:space="preserve"> </w:t>
-      </w:r>
-      <w:proofErr w:type="gramStart"/>
-      <w:r>
-        <w:t>VARCHAR(</w:t>
-      </w:r>
-      <w:proofErr w:type="gramEnd"/>
-      <w:r>
-        <w:t>30) NULL,</w:t>
-      </w:r>
-    </w:p>
-    <w:p>
-      <w:r>
-        <w:t xml:space="preserve">    </w:t>
-      </w:r>
-      <w:proofErr w:type="spellStart"/>
-      <w:r>
-        <w:t>DateOfBirth</w:t>
-      </w:r>
-      <w:proofErr w:type="spellEnd"/>
-      <w:r>
-        <w:t xml:space="preserve"> DATE NULL,</w:t>
-      </w:r>
-    </w:p>
-    <w:p>
-      <w:r>
-        <w:t xml:space="preserve">    </w:t>
-      </w:r>
-      <w:proofErr w:type="spellStart"/>
-      <w:r>
-        <w:t>ProfilePictureUrl</w:t>
-      </w:r>
-      <w:proofErr w:type="spellEnd"/>
-      <w:r>
-        <w:t xml:space="preserve"> </w:t>
-      </w:r>
-      <w:proofErr w:type="gramStart"/>
-      <w:r>
-        <w:t>VARCHAR(</w:t>
-      </w:r>
-      <w:proofErr w:type="gramEnd"/>
-      <w:r>
-        <w:t>1000) NULL,</w:t>
-      </w:r>
-    </w:p>
-    <w:p>
-      <w:r>
-        <w:t xml:space="preserve">    </w:t>
-      </w:r>
-      <w:proofErr w:type="spellStart"/>
-      <w:r>
-        <w:t>CreatedAt</w:t>
-      </w:r>
-      <w:proofErr w:type="spellEnd"/>
-      <w:r>
-        <w:t xml:space="preserve"> DATETIME DEFAULT CURRENT_TIMESTAMP,</w:t>
-      </w:r>
-    </w:p>
-    <w:p>
-      <w:r>
-        <w:t xml:space="preserve">    FOREIGN KEY (</w:t>
-      </w:r>
-      <w:proofErr w:type="spellStart"/>
-      <w:r>
-        <w:t>RoleId</w:t>
-      </w:r>
-      <w:proofErr w:type="spellEnd"/>
-      <w:r>
-        <w:t xml:space="preserve">) REFERENCES </w:t>
-      </w:r>
-      <w:proofErr w:type="gramStart"/>
-      <w:r>
-        <w:t>Roles(</w:t>
-      </w:r>
-      <w:proofErr w:type="spellStart"/>
-      <w:proofErr w:type="gramEnd"/>
-      <w:r>
-        <w:t>RoleId</w:t>
-      </w:r>
-      <w:proofErr w:type="spellEnd"/>
-      <w:r>
-        <w:t>)</w:t>
+        <w:t xml:space="preserve">    UserId INT AUTO_INCREMENT PRIMARY KEY,</w:t>
+      </w:r>
+    </w:p>
+    <w:p>
+      <w:r>
+        <w:t xml:space="preserve">    RoleId INT NOT NULL,</w:t>
+      </w:r>
+    </w:p>
+    <w:p>
+      <w:r>
+        <w:t xml:space="preserve">    FirstName VARCHAR(80) NOT NULL,</w:t>
+      </w:r>
+    </w:p>
+    <w:p>
+      <w:r>
+        <w:t xml:space="preserve">    LastName VARCHAR(80) NOT NULL,</w:t>
+      </w:r>
+    </w:p>
+    <w:p>
+      <w:r>
+        <w:t xml:space="preserve">    Email VARCHAR(255) NOT NULL UNIQUE,</w:t>
+      </w:r>
+    </w:p>
+    <w:p>
+      <w:r>
+        <w:t xml:space="preserve">    PasswordHash VARCHAR(500) NOT NULL,</w:t>
+      </w:r>
+    </w:p>
+    <w:p>
+      <w:r>
+        <w:t xml:space="preserve">    PhoneNumber VARCHAR(30) NULL,</w:t>
+      </w:r>
+    </w:p>
+    <w:p>
+      <w:r>
+        <w:t xml:space="preserve">    DateOfBirth DATE NULL,</w:t>
+      </w:r>
+    </w:p>
+    <w:p>
+      <w:r>
+        <w:t xml:space="preserve">    ProfilePictureUrl VARCHAR(1000) NULL,</w:t>
+      </w:r>
+    </w:p>
+    <w:p>
+      <w:r>
+        <w:t xml:space="preserve">    CreatedAt DATETIME DEFAULT CURRENT_TIMESTAMP,</w:t>
+      </w:r>
+    </w:p>
+    <w:p>
+      <w:r>
+        <w:t xml:space="preserve">    FOREIGN KEY (RoleId) REFERENCES Roles(RoleId)</w:t>
       </w:r>
     </w:p>
     <w:p>
@@ -374,49 +205,17 @@
     </w:p>
     <w:p>
       <w:r>
-        <w:t xml:space="preserve">    </w:t>
-      </w:r>
-      <w:proofErr w:type="spellStart"/>
-      <w:r>
-        <w:t>EventId</w:t>
-      </w:r>
-      <w:proofErr w:type="spellEnd"/>
-      <w:r>
-        <w:t xml:space="preserve"> INT AUTO_INCREMENT PRIMARY KEY,</w:t>
-      </w:r>
-    </w:p>
-    <w:p>
-      <w:r>
-        <w:t xml:space="preserve">    </w:t>
-      </w:r>
-      <w:proofErr w:type="spellStart"/>
-      <w:r>
-        <w:t>OrganiserId</w:t>
-      </w:r>
-      <w:proofErr w:type="spellEnd"/>
-      <w:r>
-        <w:t xml:space="preserve"> INT NOT NULL,</w:t>
-      </w:r>
-    </w:p>
-    <w:p>
-      <w:r>
-        <w:t xml:space="preserve">    </w:t>
-      </w:r>
-      <w:proofErr w:type="spellStart"/>
-      <w:r>
-        <w:t>EventName</w:t>
-      </w:r>
-      <w:proofErr w:type="spellEnd"/>
-      <w:r>
-        <w:t xml:space="preserve"> </w:t>
-      </w:r>
-      <w:proofErr w:type="gramStart"/>
-      <w:r>
-        <w:t>VARCHAR(</w:t>
-      </w:r>
-      <w:proofErr w:type="gramEnd"/>
-      <w:r>
-        <w:t>150) NOT NULL,</w:t>
+        <w:t xml:space="preserve">    EventId INT AUTO_INCREMENT PRIMARY KEY,</w:t>
+      </w:r>
+    </w:p>
+    <w:p>
+      <w:r>
+        <w:t xml:space="preserve">    OrganiserId INT NOT NULL,</w:t>
+      </w:r>
+    </w:p>
+    <w:p>
+      <w:r>
+        <w:t xml:space="preserve">    EventName VARCHAR(150) NOT NULL,</w:t>
       </w:r>
     </w:p>
     <w:p>
@@ -426,130 +225,37 @@
     </w:p>
     <w:p>
       <w:r>
-        <w:t xml:space="preserve">    </w:t>
-      </w:r>
-      <w:proofErr w:type="spellStart"/>
-      <w:r>
-        <w:t>EventDate</w:t>
-      </w:r>
-      <w:proofErr w:type="spellEnd"/>
-      <w:r>
-        <w:t xml:space="preserve"> DATETIME NOT NULL,</w:t>
-      </w:r>
-    </w:p>
-    <w:p>
-      <w:r>
-        <w:t xml:space="preserve">    Location </w:t>
-      </w:r>
-      <w:proofErr w:type="gramStart"/>
-      <w:r>
-        <w:t>VARCHAR(</w:t>
-      </w:r>
-      <w:proofErr w:type="gramEnd"/>
-      <w:r>
-        <w:t>150) NOT NULL,</w:t>
-      </w:r>
-    </w:p>
-    <w:p>
-      <w:r>
-        <w:t xml:space="preserve">    </w:t>
-      </w:r>
-      <w:proofErr w:type="spellStart"/>
-      <w:r>
-        <w:t>DistanceKm</w:t>
-      </w:r>
-      <w:proofErr w:type="spellEnd"/>
-      <w:r>
-        <w:t xml:space="preserve"> </w:t>
-      </w:r>
-      <w:proofErr w:type="gramStart"/>
-      <w:r>
-        <w:t>DECIMAL(</w:t>
-      </w:r>
-      <w:proofErr w:type="gramEnd"/>
-      <w:r>
-        <w:t>6,2) NOT NULL,</w:t>
-      </w:r>
-    </w:p>
-    <w:p>
-      <w:r>
-        <w:t xml:space="preserve">    </w:t>
-      </w:r>
-      <w:proofErr w:type="spellStart"/>
-      <w:r>
-        <w:t>EventType</w:t>
-      </w:r>
-      <w:proofErr w:type="spellEnd"/>
-      <w:r>
-        <w:t xml:space="preserve"> </w:t>
-      </w:r>
-      <w:proofErr w:type="gramStart"/>
-      <w:r>
-        <w:t>ENUM(</w:t>
-      </w:r>
-      <w:proofErr w:type="gramEnd"/>
-      <w:r>
-        <w:t>'Run', 'Walk', 'Cycle') NOT NULL,</w:t>
-      </w:r>
-    </w:p>
-    <w:p>
-      <w:r>
-        <w:t xml:space="preserve">    </w:t>
-      </w:r>
-      <w:proofErr w:type="spellStart"/>
-      <w:r>
-        <w:t>BannerUrl</w:t>
-      </w:r>
-      <w:proofErr w:type="spellEnd"/>
-      <w:r>
-        <w:t xml:space="preserve"> </w:t>
-      </w:r>
-      <w:proofErr w:type="gramStart"/>
-      <w:r>
-        <w:t>VARCHAR(</w:t>
-      </w:r>
-      <w:proofErr w:type="gramEnd"/>
-      <w:r>
-        <w:t>1000) NULL,</w:t>
-      </w:r>
-    </w:p>
-    <w:p>
-      <w:r>
-        <w:t xml:space="preserve">    </w:t>
-      </w:r>
-      <w:proofErr w:type="spellStart"/>
-      <w:r>
-        <w:t>CreatedAt</w:t>
-      </w:r>
-      <w:proofErr w:type="spellEnd"/>
-      <w:r>
-        <w:t xml:space="preserve"> DATETIME DEFAULT CURRENT_TIMESTAMP,</w:t>
-      </w:r>
-    </w:p>
-    <w:p>
-      <w:r>
-        <w:t xml:space="preserve">    FOREIGN KEY (</w:t>
-      </w:r>
-      <w:proofErr w:type="spellStart"/>
-      <w:r>
-        <w:t>OrganiserId</w:t>
-      </w:r>
-      <w:proofErr w:type="spellEnd"/>
-      <w:r>
-        <w:t xml:space="preserve">) REFERENCES </w:t>
-      </w:r>
-      <w:proofErr w:type="gramStart"/>
-      <w:r>
-        <w:t>Users(</w:t>
-      </w:r>
-      <w:proofErr w:type="spellStart"/>
-      <w:proofErr w:type="gramEnd"/>
-      <w:r>
-        <w:t>UserId</w:t>
-      </w:r>
-      <w:proofErr w:type="spellEnd"/>
-      <w:r>
-        <w:t>) ON DELETE CASCADE</w:t>
+        <w:t xml:space="preserve">    EventDate DATETIME NOT NULL,</w:t>
+      </w:r>
+    </w:p>
+    <w:p>
+      <w:r>
+        <w:t xml:space="preserve">    Location VARCHAR(150) NOT NULL,</w:t>
+      </w:r>
+    </w:p>
+    <w:p>
+      <w:r>
+        <w:t xml:space="preserve">    DistanceKm DECIMAL(6,2) NOT NULL,</w:t>
+      </w:r>
+    </w:p>
+    <w:p>
+      <w:r>
+        <w:t xml:space="preserve">    EventType ENUM('Run', 'Walk', 'Cycle') NOT NULL,</w:t>
+      </w:r>
+    </w:p>
+    <w:p>
+      <w:r>
+        <w:t xml:space="preserve">    BannerUrl VARCHAR(1000) NULL,</w:t>
+      </w:r>
+    </w:p>
+    <w:p>
+      <w:r>
+        <w:t xml:space="preserve">    CreatedAt DATETIME DEFAULT CURRENT_TIMESTAMP,</w:t>
+      </w:r>
+    </w:p>
+    <w:p>
+      <w:r>
+        <w:t xml:space="preserve">    FOREIGN KEY (OrganiserId) REFERENCES Users(UserId) ON DELETE CASCADE</w:t>
       </w:r>
     </w:p>
     <w:p>
@@ -583,122 +289,37 @@
     </w:p>
     <w:p>
       <w:r>
-        <w:t xml:space="preserve">    </w:t>
-      </w:r>
-      <w:proofErr w:type="spellStart"/>
-      <w:r>
-        <w:t>CategoryId</w:t>
-      </w:r>
-      <w:proofErr w:type="spellEnd"/>
-      <w:r>
-        <w:t xml:space="preserve"> INT AUTO_INCREMENT PRIMARY KEY,</w:t>
-      </w:r>
-    </w:p>
-    <w:p>
-      <w:r>
-        <w:t xml:space="preserve">    </w:t>
-      </w:r>
-      <w:proofErr w:type="spellStart"/>
-      <w:r>
-        <w:t>EventId</w:t>
-      </w:r>
-      <w:proofErr w:type="spellEnd"/>
-      <w:r>
-        <w:t xml:space="preserve"> INT NOT NULL,</w:t>
-      </w:r>
-    </w:p>
-    <w:p>
-      <w:r>
-        <w:t xml:space="preserve">    </w:t>
-      </w:r>
-      <w:proofErr w:type="spellStart"/>
-      <w:r>
-        <w:t>CategoryName</w:t>
-      </w:r>
-      <w:proofErr w:type="spellEnd"/>
-      <w:r>
-        <w:t xml:space="preserve"> </w:t>
-      </w:r>
-      <w:proofErr w:type="gramStart"/>
-      <w:r>
-        <w:t>VARCHAR(</w:t>
-      </w:r>
-      <w:proofErr w:type="gramEnd"/>
-      <w:r>
-        <w:t>100) NOT NULL,</w:t>
-      </w:r>
-    </w:p>
-    <w:p>
-      <w:r>
-        <w:t xml:space="preserve">    </w:t>
-      </w:r>
-      <w:proofErr w:type="spellStart"/>
-      <w:r>
-        <w:t>MinAge</w:t>
-      </w:r>
-      <w:proofErr w:type="spellEnd"/>
-      <w:r>
-        <w:t xml:space="preserve"> INT NULL,</w:t>
-      </w:r>
-    </w:p>
-    <w:p>
-      <w:r>
-        <w:t xml:space="preserve">    </w:t>
-      </w:r>
-      <w:proofErr w:type="spellStart"/>
-      <w:r>
-        <w:t>MaxAge</w:t>
-      </w:r>
-      <w:proofErr w:type="spellEnd"/>
-      <w:r>
-        <w:t xml:space="preserve"> INT NULL,</w:t>
-      </w:r>
-    </w:p>
-    <w:p>
-      <w:r>
-        <w:t xml:space="preserve">    </w:t>
-      </w:r>
-      <w:proofErr w:type="spellStart"/>
-      <w:r>
-        <w:t>DistanceKm</w:t>
-      </w:r>
-      <w:proofErr w:type="spellEnd"/>
-      <w:r>
-        <w:t xml:space="preserve"> </w:t>
-      </w:r>
-      <w:proofErr w:type="gramStart"/>
-      <w:r>
-        <w:t>DECIMAL(</w:t>
-      </w:r>
-      <w:proofErr w:type="gramEnd"/>
-      <w:r>
-        <w:t>6,2) NOT NULL,</w:t>
-      </w:r>
-    </w:p>
-    <w:p>
-      <w:r>
-        <w:t xml:space="preserve">    FOREIGN KEY (</w:t>
-      </w:r>
-      <w:proofErr w:type="spellStart"/>
-      <w:r>
-        <w:t>EventId</w:t>
-      </w:r>
-      <w:proofErr w:type="spellEnd"/>
-      <w:r>
-        <w:t xml:space="preserve">) REFERENCES </w:t>
-      </w:r>
-      <w:proofErr w:type="gramStart"/>
-      <w:r>
-        <w:t>Events(</w:t>
-      </w:r>
-      <w:proofErr w:type="spellStart"/>
-      <w:proofErr w:type="gramEnd"/>
-      <w:r>
-        <w:t>EventId</w:t>
-      </w:r>
-      <w:proofErr w:type="spellEnd"/>
-      <w:r>
-        <w:t>) ON DELETE CASCADE</w:t>
+        <w:t xml:space="preserve">    CategoryId INT AUTO_INCREMENT PRIMARY KEY,</w:t>
+      </w:r>
+    </w:p>
+    <w:p>
+      <w:r>
+        <w:t xml:space="preserve">    EventId INT NOT NULL,</w:t>
+      </w:r>
+    </w:p>
+    <w:p>
+      <w:r>
+        <w:t xml:space="preserve">    CategoryName VARCHAR(100) NOT NULL,</w:t>
+      </w:r>
+    </w:p>
+    <w:p>
+      <w:r>
+        <w:t xml:space="preserve">    MinAge INT NULL,</w:t>
+      </w:r>
+    </w:p>
+    <w:p>
+      <w:r>
+        <w:t xml:space="preserve">    MaxAge INT NULL,</w:t>
+      </w:r>
+    </w:p>
+    <w:p>
+      <w:r>
+        <w:t xml:space="preserve">    DistanceKm DECIMAL(6,2) NOT NULL,</w:t>
+      </w:r>
+    </w:p>
+    <w:p>
+      <w:r>
+        <w:t xml:space="preserve">    FOREIGN KEY (EventId) REFERENCES Events(EventId) ON DELETE CASCADE</w:t>
       </w:r>
     </w:p>
     <w:p>
@@ -752,166 +373,47 @@
     </w:p>
     <w:p>
       <w:r>
-        <w:t xml:space="preserve">    </w:t>
-      </w:r>
-      <w:proofErr w:type="spellStart"/>
-      <w:r>
-        <w:t>EnrolmentId</w:t>
-      </w:r>
-      <w:proofErr w:type="spellEnd"/>
-      <w:r>
-        <w:t xml:space="preserve"> INT AUTO_INCREMENT PRIMARY KEY,</w:t>
-      </w:r>
-    </w:p>
-    <w:p>
-      <w:r>
-        <w:t xml:space="preserve">    </w:t>
-      </w:r>
-      <w:proofErr w:type="spellStart"/>
-      <w:r>
-        <w:t>ParticipantId</w:t>
-      </w:r>
-      <w:proofErr w:type="spellEnd"/>
-      <w:r>
-        <w:t xml:space="preserve"> INT NOT NULL,</w:t>
-      </w:r>
-    </w:p>
-    <w:p>
-      <w:r>
-        <w:t xml:space="preserve">    </w:t>
-      </w:r>
-      <w:proofErr w:type="spellStart"/>
-      <w:r>
-        <w:t>EventId</w:t>
-      </w:r>
-      <w:proofErr w:type="spellEnd"/>
-      <w:r>
-        <w:t xml:space="preserve"> INT NOT NULL,</w:t>
-      </w:r>
-    </w:p>
-    <w:p>
-      <w:r>
-        <w:t xml:space="preserve">    </w:t>
-      </w:r>
-      <w:proofErr w:type="spellStart"/>
-      <w:r>
-        <w:t>CategoryId</w:t>
-      </w:r>
-      <w:proofErr w:type="spellEnd"/>
-      <w:r>
-        <w:t xml:space="preserve"> INT NOT NULL,</w:t>
-      </w:r>
-    </w:p>
-    <w:p>
-      <w:r>
-        <w:t xml:space="preserve">    </w:t>
-      </w:r>
-      <w:proofErr w:type="spellStart"/>
-      <w:r>
-        <w:t>EnrolmentDate</w:t>
-      </w:r>
-      <w:proofErr w:type="spellEnd"/>
-      <w:r>
-        <w:t xml:space="preserve"> DATETIME DEFAULT CURRENT_TIMESTAMP,</w:t>
-      </w:r>
-    </w:p>
-    <w:p>
-      <w:r>
-        <w:t xml:space="preserve">    </w:t>
-      </w:r>
-      <w:proofErr w:type="spellStart"/>
-      <w:r>
-        <w:t>EnrolmentStatus</w:t>
-      </w:r>
-      <w:proofErr w:type="spellEnd"/>
-      <w:r>
-        <w:t xml:space="preserve"> </w:t>
-      </w:r>
-      <w:proofErr w:type="gramStart"/>
-      <w:r>
-        <w:t>ENUM(</w:t>
-      </w:r>
-      <w:proofErr w:type="gramEnd"/>
-      <w:r>
-        <w:t>'Confirmed', 'Pending', 'Cancelled') DEFAULT 'Confirmed',</w:t>
-      </w:r>
-    </w:p>
-    <w:p>
-      <w:r>
-        <w:t xml:space="preserve">    FOREIGN KEY (</w:t>
-      </w:r>
-      <w:proofErr w:type="spellStart"/>
-      <w:r>
-        <w:t>ParticipantId</w:t>
-      </w:r>
-      <w:proofErr w:type="spellEnd"/>
-      <w:r>
-        <w:t xml:space="preserve">) REFERENCES </w:t>
-      </w:r>
-      <w:proofErr w:type="gramStart"/>
-      <w:r>
-        <w:t>Users(</w:t>
-      </w:r>
-      <w:proofErr w:type="spellStart"/>
-      <w:proofErr w:type="gramEnd"/>
-      <w:r>
-        <w:t>UserId</w:t>
-      </w:r>
-      <w:proofErr w:type="spellEnd"/>
-      <w:r>
-        <w:t>),</w:t>
-      </w:r>
-    </w:p>
-    <w:p>
-      <w:r>
-        <w:t xml:space="preserve">    FOREIGN KEY (</w:t>
-      </w:r>
-      <w:proofErr w:type="spellStart"/>
-      <w:r>
-        <w:t>EventId</w:t>
-      </w:r>
-      <w:proofErr w:type="spellEnd"/>
-      <w:r>
-        <w:t xml:space="preserve">) REFERENCES </w:t>
-      </w:r>
-      <w:proofErr w:type="gramStart"/>
-      <w:r>
-        <w:t>Events(</w:t>
-      </w:r>
-      <w:proofErr w:type="spellStart"/>
-      <w:proofErr w:type="gramEnd"/>
-      <w:r>
-        <w:t>EventId</w:t>
-      </w:r>
-      <w:proofErr w:type="spellEnd"/>
-      <w:r>
-        <w:t>),</w:t>
-      </w:r>
-    </w:p>
-    <w:p>
-      <w:r>
-        <w:t xml:space="preserve">    FOREIGN KEY (</w:t>
-      </w:r>
-      <w:proofErr w:type="spellStart"/>
-      <w:r>
-        <w:t>CategoryId</w:t>
-      </w:r>
-      <w:proofErr w:type="spellEnd"/>
-      <w:r>
-        <w:t xml:space="preserve">) REFERENCES </w:t>
-      </w:r>
-      <w:proofErr w:type="gramStart"/>
-      <w:r>
-        <w:t>Categories(</w:t>
-      </w:r>
-      <w:proofErr w:type="spellStart"/>
-      <w:proofErr w:type="gramEnd"/>
-      <w:r>
-        <w:t>CategoryId</w:t>
-      </w:r>
-      <w:proofErr w:type="spellEnd"/>
-      <w:r>
-        <w:t>)</w:t>
+        <w:t xml:space="preserve">    EnrolmentId INT AUTO_INCREMENT PRIMARY KEY,</w:t>
+      </w:r>
+    </w:p>
+    <w:p>
+      <w:r>
+        <w:t xml:space="preserve">    ParticipantId INT NOT NULL,</w:t>
+      </w:r>
+    </w:p>
+    <w:p>
+      <w:r>
+        <w:t xml:space="preserve">    EventId INT NOT NULL,</w:t>
+      </w:r>
+    </w:p>
+    <w:p>
+      <w:r>
+        <w:t xml:space="preserve">    CategoryId INT NOT NULL,</w:t>
+      </w:r>
+    </w:p>
+    <w:p>
+      <w:r>
+        <w:t xml:space="preserve">    EnrolmentDate DATETIME DEFAULT CURRENT_TIMESTAMP,</w:t>
+      </w:r>
+    </w:p>
+    <w:p>
+      <w:r>
+        <w:t xml:space="preserve">    EnrolmentStatus ENUM('Confirmed', 'Pending', 'Cancelled') DEFAULT 'Confirmed',</w:t>
+      </w:r>
+    </w:p>
+    <w:p>
+      <w:r>
+        <w:t xml:space="preserve">    FOREIGN KEY (ParticipantId) REFERENCES Users(UserId),</w:t>
+      </w:r>
+    </w:p>
+    <w:p>
+      <w:r>
+        <w:t xml:space="preserve">    FOREIGN KEY (EventId) REFERENCES Events(EventId),</w:t>
+      </w:r>
+    </w:p>
+    <w:p>
+      <w:r>
+        <w:t xml:space="preserve">    FOREIGN KEY (CategoryId) REFERENCES Categories(CategoryId)</w:t>
       </w:r>
     </w:p>
     <w:p>
@@ -945,93 +447,32 @@
     </w:p>
     <w:p>
       <w:r>
-        <w:t xml:space="preserve">    </w:t>
-      </w:r>
-      <w:proofErr w:type="spellStart"/>
-      <w:r>
-        <w:t>ResultId</w:t>
-      </w:r>
-      <w:proofErr w:type="spellEnd"/>
-      <w:r>
-        <w:t xml:space="preserve"> INT AUTO_INCREMENT PRIMARY KEY,</w:t>
-      </w:r>
-    </w:p>
-    <w:p>
-      <w:r>
-        <w:t xml:space="preserve">    </w:t>
-      </w:r>
-      <w:proofErr w:type="spellStart"/>
-      <w:r>
-        <w:t>EnrolmentId</w:t>
-      </w:r>
-      <w:proofErr w:type="spellEnd"/>
-      <w:r>
-        <w:t xml:space="preserve"> INT NOT NULL UNIQUE,</w:t>
-      </w:r>
-    </w:p>
-    <w:p>
-      <w:r>
-        <w:t xml:space="preserve">    </w:t>
-      </w:r>
-      <w:proofErr w:type="spellStart"/>
-      <w:r>
-        <w:t>FinishTime</w:t>
-      </w:r>
-      <w:proofErr w:type="spellEnd"/>
-      <w:r>
-        <w:t xml:space="preserve"> TIME NOT NULL,</w:t>
-      </w:r>
-    </w:p>
-    <w:p>
-      <w:r>
-        <w:t xml:space="preserve">    </w:t>
-      </w:r>
-      <w:proofErr w:type="spellStart"/>
-      <w:r>
-        <w:t>FinishingPosition</w:t>
-      </w:r>
-      <w:proofErr w:type="spellEnd"/>
-      <w:r>
-        <w:t xml:space="preserve"> INT NOT NULL,</w:t>
-      </w:r>
-    </w:p>
-    <w:p>
-      <w:r>
-        <w:t xml:space="preserve">    </w:t>
-      </w:r>
-      <w:proofErr w:type="spellStart"/>
-      <w:r>
-        <w:t>PublishedAt</w:t>
-      </w:r>
-      <w:proofErr w:type="spellEnd"/>
-      <w:r>
-        <w:t xml:space="preserve"> DATETIME DEFAULT CURRENT_TIMESTAMP,</w:t>
-      </w:r>
-    </w:p>
-    <w:p>
-      <w:r>
-        <w:t xml:space="preserve">    FOREIGN KEY (</w:t>
-      </w:r>
-      <w:proofErr w:type="spellStart"/>
-      <w:r>
-        <w:t>EnrolmentId</w:t>
-      </w:r>
-      <w:proofErr w:type="spellEnd"/>
-      <w:r>
-        <w:t xml:space="preserve">) REFERENCES </w:t>
-      </w:r>
-      <w:proofErr w:type="gramStart"/>
-      <w:r>
-        <w:t>Enrolments(</w:t>
-      </w:r>
-      <w:proofErr w:type="spellStart"/>
-      <w:proofErr w:type="gramEnd"/>
-      <w:r>
-        <w:t>EnrolmentId</w:t>
-      </w:r>
-      <w:proofErr w:type="spellEnd"/>
-      <w:r>
-        <w:t>) ON DELETE CASCADE</w:t>
+        <w:t xml:space="preserve">    ResultId INT AUTO_INCREMENT PRIMARY KEY,</w:t>
+      </w:r>
+    </w:p>
+    <w:p>
+      <w:r>
+        <w:t xml:space="preserve">    EnrolmentId INT NOT NULL UNIQUE,</w:t>
+      </w:r>
+    </w:p>
+    <w:p>
+      <w:r>
+        <w:t xml:space="preserve">    FinishTime TIME NOT NULL,</w:t>
+      </w:r>
+    </w:p>
+    <w:p>
+      <w:r>
+        <w:t xml:space="preserve">    FinishingPosition INT NOT NULL,</w:t>
+      </w:r>
+    </w:p>
+    <w:p>
+      <w:r>
+        <w:t xml:space="preserve">    PublishedAt DATETIME DEFAULT CURRENT_TIMESTAMP,</w:t>
+      </w:r>
+    </w:p>
+    <w:p>
+      <w:r>
+        <w:t xml:space="preserve">    FOREIGN KEY (EnrolmentId) REFERENCES Enrolments(EnrolmentId) ON DELETE CASCADE</w:t>
       </w:r>
     </w:p>
     <w:p>
@@ -1084,15 +525,7 @@
     </w:p>
     <w:p>
       <w:r>
-        <w:t>INSERT INTO Roles (</w:t>
-      </w:r>
-      <w:proofErr w:type="spellStart"/>
-      <w:r>
-        <w:t>RoleName</w:t>
-      </w:r>
-      <w:proofErr w:type="spellEnd"/>
-      <w:r>
-        <w:t xml:space="preserve">) VALUES </w:t>
+        <w:t xml:space="preserve">INSERT INTO Roles (RoleName) VALUES </w:t>
       </w:r>
     </w:p>
     <w:p>
@@ -1102,13 +535,8 @@
     </w:p>
     <w:p>
       <w:r>
-        <w:t>('Participant'</w:t>
-      </w:r>
-      <w:proofErr w:type="gramStart"/>
-      <w:r>
-        <w:t>);</w:t>
-      </w:r>
-      <w:proofErr w:type="gramEnd"/>
+        <w:t>('Participant');</w:t>
+      </w:r>
     </w:p>
     <w:p>
       <w:pPr>
@@ -1131,39 +559,7 @@
     </w:p>
     <w:p>
       <w:r>
-        <w:t>INSERT INTO Users (</w:t>
-      </w:r>
-      <w:proofErr w:type="spellStart"/>
-      <w:r>
-        <w:t>RoleId</w:t>
-      </w:r>
-      <w:proofErr w:type="spellEnd"/>
-      <w:r>
-        <w:t xml:space="preserve">, FirstName, LastName, Email, </w:t>
-      </w:r>
-      <w:proofErr w:type="spellStart"/>
-      <w:r>
-        <w:t>PasswordHash</w:t>
-      </w:r>
-      <w:proofErr w:type="spellEnd"/>
-      <w:r>
-        <w:t xml:space="preserve">, </w:t>
-      </w:r>
-      <w:proofErr w:type="spellStart"/>
-      <w:r>
-        <w:t>PhoneNumber</w:t>
-      </w:r>
-      <w:proofErr w:type="spellEnd"/>
-      <w:r>
-        <w:t xml:space="preserve">, </w:t>
-      </w:r>
-      <w:proofErr w:type="spellStart"/>
-      <w:r>
-        <w:t>DateOfBirth</w:t>
-      </w:r>
-      <w:proofErr w:type="spellEnd"/>
-      <w:r>
-        <w:t>) VALUES</w:t>
+        <w:t>INSERT INTO Users (RoleId, FirstName, LastName, Email, PasswordHash, PhoneNumber, DateOfBirth) VALUES</w:t>
       </w:r>
     </w:p>
     <w:p>
@@ -1183,13 +579,8 @@
     </w:p>
     <w:p>
       <w:r>
-        <w:t>(2, 'Sarah', 'Connor', 'sarah@runner.co.za', 'hashed_password_4', '0723334444', '2001-06-30'</w:t>
-      </w:r>
-      <w:proofErr w:type="gramStart"/>
-      <w:r>
-        <w:t>);</w:t>
-      </w:r>
-      <w:proofErr w:type="gramEnd"/>
+        <w:t>(2, 'Sarah', 'Connor', 'sarah@runner.co.za', 'hashed_password_4', '0723334444', '2001-06-30');</w:t>
+      </w:r>
     </w:p>
     <w:p>
       <w:pPr>
@@ -1212,60 +603,12 @@
     </w:p>
     <w:p>
       <w:r>
-        <w:t>INSERT INTO Events (</w:t>
-      </w:r>
-      <w:proofErr w:type="spellStart"/>
-      <w:r>
-        <w:t>OrganiserId</w:t>
-      </w:r>
-      <w:proofErr w:type="spellEnd"/>
-      <w:r>
-        <w:t xml:space="preserve">, </w:t>
-      </w:r>
-      <w:proofErr w:type="spellStart"/>
-      <w:r>
-        <w:t>EventName</w:t>
-      </w:r>
-      <w:proofErr w:type="spellEnd"/>
-      <w:r>
-        <w:t xml:space="preserve">, Description, </w:t>
-      </w:r>
-      <w:proofErr w:type="spellStart"/>
-      <w:r>
-        <w:t>EventDate</w:t>
-      </w:r>
-      <w:proofErr w:type="spellEnd"/>
-      <w:r>
-        <w:t xml:space="preserve">, Location, </w:t>
-      </w:r>
-      <w:proofErr w:type="spellStart"/>
-      <w:r>
-        <w:t>DistanceKm</w:t>
-      </w:r>
-      <w:proofErr w:type="spellEnd"/>
-      <w:r>
-        <w:t xml:space="preserve">, </w:t>
-      </w:r>
-      <w:proofErr w:type="spellStart"/>
-      <w:r>
-        <w:t>EventType</w:t>
-      </w:r>
-      <w:proofErr w:type="spellEnd"/>
-      <w:r>
-        <w:t>) VALUES</w:t>
-      </w:r>
-    </w:p>
-    <w:p>
-      <w:r>
-        <w:t>(1, 'Soweto Marathon', '</w:t>
-      </w:r>
-      <w:proofErr w:type="gramStart"/>
-      <w:r>
-        <w:t>Iconic road</w:t>
-      </w:r>
-      <w:proofErr w:type="gramEnd"/>
-      <w:r>
-        <w:t xml:space="preserve"> running event across Soweto.', '2026-11-01 06:00:00', 'Soweto, Johannesburg', 42.20, 'Run'),</w:t>
+        <w:t>INSERT INTO Events (OrganiserId, EventName, Description, EventDate, Location, DistanceKm, EventType) VALUES</w:t>
+      </w:r>
+    </w:p>
+    <w:p>
+      <w:r>
+        <w:t>(1, 'Soweto Marathon', 'Iconic road running event across Soweto.', '2026-11-01 06:00:00', 'Soweto, Johannesburg', 42.20, 'Run'),</w:t>
       </w:r>
     </w:p>
     <w:p>
@@ -1275,13 +618,8 @@
     </w:p>
     <w:p>
       <w:r>
-        <w:t>(2, 'Cape Peninsula Cycle Classic', 'Community cycling challenge along scenic routes.', '2026-10-15 06:30:00', 'Cape Town', 40.00, 'Cycle'</w:t>
-      </w:r>
-      <w:proofErr w:type="gramStart"/>
-      <w:r>
-        <w:t>);</w:t>
-      </w:r>
-      <w:proofErr w:type="gramEnd"/>
+        <w:t>(2, 'Cape Peninsula Cycle Classic', 'Community cycling challenge along scenic routes.', '2026-10-15 06:30:00', 'Cape Town', 40.00, 'Cycle');</w:t>
+      </w:r>
     </w:p>
     <w:p>
       <w:pPr>
@@ -1304,47 +642,7 @@
     </w:p>
     <w:p>
       <w:r>
-        <w:t>INSERT INTO Categories (</w:t>
-      </w:r>
-      <w:proofErr w:type="spellStart"/>
-      <w:r>
-        <w:t>EventId</w:t>
-      </w:r>
-      <w:proofErr w:type="spellEnd"/>
-      <w:r>
-        <w:t xml:space="preserve">, </w:t>
-      </w:r>
-      <w:proofErr w:type="spellStart"/>
-      <w:r>
-        <w:t>CategoryName</w:t>
-      </w:r>
-      <w:proofErr w:type="spellEnd"/>
-      <w:r>
-        <w:t xml:space="preserve">, </w:t>
-      </w:r>
-      <w:proofErr w:type="spellStart"/>
-      <w:r>
-        <w:t>MinAge</w:t>
-      </w:r>
-      <w:proofErr w:type="spellEnd"/>
-      <w:r>
-        <w:t xml:space="preserve">, </w:t>
-      </w:r>
-      <w:proofErr w:type="spellStart"/>
-      <w:r>
-        <w:t>MaxAge</w:t>
-      </w:r>
-      <w:proofErr w:type="spellEnd"/>
-      <w:r>
-        <w:t xml:space="preserve">, </w:t>
-      </w:r>
-      <w:proofErr w:type="spellStart"/>
-      <w:r>
-        <w:t>DistanceKm</w:t>
-      </w:r>
-      <w:proofErr w:type="spellEnd"/>
-      <w:r>
-        <w:t>) VALUES</w:t>
+        <w:t>INSERT INTO Categories (EventId, CategoryName, MinAge, MaxAge, DistanceKm) VALUES</w:t>
       </w:r>
     </w:p>
     <w:p>
@@ -1364,13 +662,8 @@
     </w:p>
     <w:p>
       <w:r>
-        <w:t>(3, '40km Road Cycle Challenge', 16, 99, 40.00</w:t>
-      </w:r>
-      <w:proofErr w:type="gramStart"/>
-      <w:r>
-        <w:t>);</w:t>
-      </w:r>
-      <w:proofErr w:type="gramEnd"/>
+        <w:t>(3, '40km Road Cycle Challenge', 16, 99, 40.00);</w:t>
+      </w:r>
     </w:p>
     <w:p>
       <w:pPr>
@@ -1394,39 +687,7 @@
     </w:p>
     <w:p>
       <w:r>
-        <w:t>INSERT INTO Enrolments (</w:t>
-      </w:r>
-      <w:proofErr w:type="spellStart"/>
-      <w:r>
-        <w:t>ParticipantId</w:t>
-      </w:r>
-      <w:proofErr w:type="spellEnd"/>
-      <w:r>
-        <w:t xml:space="preserve">, </w:t>
-      </w:r>
-      <w:proofErr w:type="spellStart"/>
-      <w:r>
-        <w:t>EventId</w:t>
-      </w:r>
-      <w:proofErr w:type="spellEnd"/>
-      <w:r>
-        <w:t xml:space="preserve">, </w:t>
-      </w:r>
-      <w:proofErr w:type="spellStart"/>
-      <w:r>
-        <w:t>CategoryId</w:t>
-      </w:r>
-      <w:proofErr w:type="spellEnd"/>
-      <w:r>
-        <w:t xml:space="preserve">, </w:t>
-      </w:r>
-      <w:proofErr w:type="spellStart"/>
-      <w:r>
-        <w:t>EnrolmentStatus</w:t>
-      </w:r>
-      <w:proofErr w:type="spellEnd"/>
-      <w:r>
-        <w:t>) VALUES</w:t>
+        <w:t>INSERT INTO Enrolments (ParticipantId, EventId, CategoryId, EnrolmentStatus) VALUES</w:t>
       </w:r>
     </w:p>
     <w:p>
@@ -1441,13 +702,8 @@
     </w:p>
     <w:p>
       <w:r>
-        <w:t>(3, 2, 3, 'Confirmed'</w:t>
-      </w:r>
-      <w:proofErr w:type="gramStart"/>
-      <w:r>
-        <w:t>);</w:t>
-      </w:r>
-      <w:proofErr w:type="gramEnd"/>
+        <w:t>(3, 2, 3, 'Confirmed');</w:t>
+      </w:r>
     </w:p>
     <w:p>
       <w:pPr>
@@ -1470,31 +726,7 @@
     </w:p>
     <w:p>
       <w:r>
-        <w:t>INSERT INTO Results (</w:t>
-      </w:r>
-      <w:proofErr w:type="spellStart"/>
-      <w:r>
-        <w:t>EnrolmentId</w:t>
-      </w:r>
-      <w:proofErr w:type="spellEnd"/>
-      <w:r>
-        <w:t xml:space="preserve">, </w:t>
-      </w:r>
-      <w:proofErr w:type="spellStart"/>
-      <w:r>
-        <w:t>FinishTime</w:t>
-      </w:r>
-      <w:proofErr w:type="spellEnd"/>
-      <w:r>
-        <w:t xml:space="preserve">, </w:t>
-      </w:r>
-      <w:proofErr w:type="spellStart"/>
-      <w:r>
-        <w:t>FinishingPosition</w:t>
-      </w:r>
-      <w:proofErr w:type="spellEnd"/>
-      <w:r>
-        <w:t>) VALUES</w:t>
+        <w:t>INSERT INTO Results (EnrolmentId, FinishTime, FinishingPosition) VALUES</w:t>
       </w:r>
     </w:p>
     <w:p>
@@ -1516,6 +748,9 @@
     </w:p>
     <w:p>
       <w:r>
+        <w:rPr>
+          <w:noProof/>
+        </w:rPr>
         <w:drawing>
           <wp:inline distT="0" distB="0" distL="0" distR="0" wp14:anchorId="36DB1BA3" wp14:editId="23E72BDD">
             <wp:extent cx="5731510" cy="2375535"/>
@@ -1555,6 +790,9 @@
     </w:p>
     <w:p>
       <w:r>
+        <w:rPr>
+          <w:noProof/>
+        </w:rPr>
         <w:drawing>
           <wp:inline distT="0" distB="0" distL="0" distR="0" wp14:anchorId="4174E58D" wp14:editId="46935984">
             <wp:extent cx="5731510" cy="2221230"/>
@@ -1594,6 +832,9 @@
     </w:p>
     <w:p>
       <w:r>
+        <w:rPr>
+          <w:noProof/>
+        </w:rPr>
         <w:lastRenderedPageBreak/>
         <w:drawing>
           <wp:inline distT="0" distB="0" distL="0" distR="0" wp14:anchorId="14E6934F" wp14:editId="737D3480">
@@ -1634,6 +875,9 @@
     </w:p>
     <w:p>
       <w:r>
+        <w:rPr>
+          <w:noProof/>
+        </w:rPr>
         <w:drawing>
           <wp:inline distT="0" distB="0" distL="0" distR="0" wp14:anchorId="15B9F8BB" wp14:editId="7354D9DB">
             <wp:extent cx="5731510" cy="2007235"/>
@@ -1673,6 +917,9 @@
     </w:p>
     <w:p>
       <w:r>
+        <w:rPr>
+          <w:noProof/>
+        </w:rPr>
         <w:drawing>
           <wp:inline distT="0" distB="0" distL="0" distR="0" wp14:anchorId="1724E3BC" wp14:editId="4B4403A0">
             <wp:extent cx="5731510" cy="2087880"/>
@@ -1712,6 +959,9 @@
     </w:p>
     <w:p>
       <w:r>
+        <w:rPr>
+          <w:noProof/>
+        </w:rPr>
         <w:drawing>
           <wp:inline distT="0" distB="0" distL="0" distR="0" wp14:anchorId="5730E0C5" wp14:editId="4A104B4D">
             <wp:extent cx="5731510" cy="1973580"/>
@@ -1757,15 +1007,7 @@
     </w:p>
     <w:p>
       <w:r>
-        <w:t xml:space="preserve">The </w:t>
-      </w:r>
-      <w:proofErr w:type="spellStart"/>
-      <w:r>
-        <w:t>RaceDay</w:t>
-      </w:r>
-      <w:proofErr w:type="spellEnd"/>
-      <w:r>
-        <w:t xml:space="preserve"> database was designed around six entities.</w:t>
+        <w:t>The RaceDay database was designed around six entities.</w:t>
       </w:r>
     </w:p>
     <w:p>
@@ -1785,15 +1027,7 @@
     </w:p>
     <w:p>
       <w:r>
-        <w:t xml:space="preserve">This relational structure reduces unnecessary duplication and provides clear relationships between users, events, categories, </w:t>
-      </w:r>
-      <w:proofErr w:type="gramStart"/>
-      <w:r>
-        <w:t>enrolments</w:t>
-      </w:r>
-      <w:proofErr w:type="gramEnd"/>
-      <w:r>
-        <w:t xml:space="preserve"> and results.</w:t>
+        <w:t>This relational structure reduces unnecessary duplication and provides clear relationships between users, events, categories, enrolments and results.</w:t>
       </w:r>
     </w:p>
     <w:sectPr>

</xml_diff>